<commit_message>
change the word a bit
</commit_message>
<xml_diff>
--- a/海洋时事与法治观察_五人8分钟演讲稿.docx
+++ b/海洋时事与法治观察_五人8分钟演讲稿.docx
@@ -808,8 +808,6 @@
         </w:rPr>
         <w:t>新闻按2026年10月6日至12日的原报道发布日期选取；此前工作、设计目标和累计成果均保留原有口径。事实与本组法治观察分开表述。</w:t>
       </w:r>
-      <w:bookmarkStart w:id="0" w:name="_GoBack"/>
-      <w:bookmarkEnd w:id="0"/>
     </w:p>
     <w:p>
       <w:pPr>
@@ -983,15 +981,12 @@
       </w:r>
     </w:p>
     <w:p>
-      <w:r>
-        <w:t>下面请第二位同学介绍生态修复和散货安全。</w:t>
-      </w:r>
-    </w:p>
-    <w:p>
       <w:pPr>
         <w:pStyle w:val="3"/>
         <w:pageBreakBefore/>
       </w:pPr>
+      <w:bookmarkStart w:id="0" w:name="_GoBack"/>
+      <w:bookmarkEnd w:id="0"/>
       <w:r>
         <w:t>演讲者2</w:t>
       </w:r>
@@ -1129,11 +1124,6 @@
       </w:r>
     </w:p>
     <w:p>
-      <w:r>
-        <w:t>下面请第三位同学介绍港口保畅与燃料服务。</w:t>
-      </w:r>
-    </w:p>
-    <w:p>
       <w:pPr>
         <w:pStyle w:val="3"/>
         <w:pageBreakBefore/>
@@ -1275,11 +1265,6 @@
       </w:r>
     </w:p>
     <w:p>
-      <w:r>
-        <w:t>下面请第四位同学介绍国际海洋合作。</w:t>
-      </w:r>
-    </w:p>
-    <w:p>
       <w:pPr>
         <w:pStyle w:val="3"/>
         <w:pageBreakBefore/>
@@ -1418,11 +1403,6 @@
           <w:sz w:val="20"/>
         </w:rPr>
         <w:t>交接  预留4秒</w:t>
-      </w:r>
-    </w:p>
-    <w:p>
-      <w:r>
-        <w:t>最后请第五位同学介绍数字港口与公海治理。</w:t>
       </w:r>
     </w:p>
     <w:p>

</xml_diff>